<commit_message>
Removing solution files, updating lecture 4
</commit_message>
<xml_diff>
--- a/homework/hw-04_MH.docx
+++ b/homework/hw-04_MH.docx
@@ -184,23 +184,7 @@
         </w:numPr>
       </w:pPr>
       <w:r>
-        <w:t xml:space="preserve">Consider a randomly selected household with two unvaccinated children from this population. Given that the older sibling does NOT have chicken pox, what is the probability that the younger sibling has chicken pox? Use the</w:t>
-      </w:r>
-      <w:r>
-        <w:t xml:space="preserve"> </w:t>
-      </w:r>
-      <w:r>
-        <w:rPr>
-          <w:b/>
-          <w:bCs/>
-        </w:rPr>
-        <w:t xml:space="preserve">Law of Total Probability</w:t>
-      </w:r>
-      <w:r>
-        <w:t xml:space="preserve"> </w:t>
-      </w:r>
-      <w:r>
-        <w:t xml:space="preserve">to find your answer, and show your work.</w:t>
+        <w:t xml:space="preserve">Consider a randomly selected household with two unvaccinated children from this population. Given that the older sibling does NOT have chicken pox, what is the probability that the younger sibling has chicken pox?</w:t>
       </w:r>
     </w:p>
     <w:bookmarkEnd w:id="11"/>
@@ -342,39 +326,13 @@
       </w:r>
     </w:p>
     <w:bookmarkEnd w:id="12"/>
-    <w:bookmarkStart w:id="13" w:name="exercise-3-brain-damage-biomarker"/>
+    <w:bookmarkStart w:id="16" w:name="exercise-3-roc-curve"/>
     <w:p>
       <w:pPr>
         <w:pStyle w:val="Heading2"/>
       </w:pPr>
       <w:r>
-        <w:t xml:space="preserve">Exercise 3: Brain damage biomarker</w:t>
-      </w:r>
-    </w:p>
-    <w:p>
-      <w:pPr>
-        <w:pStyle w:val="FirstParagraph"/>
-      </w:pPr>
-      <w:r>
-        <w:t xml:space="preserve">The same investigators from the study in the previous question also examined values of NDKA, a biomarker for brain damage, and classified levels as being “high” or “low.” The specificity and sensitivity of using high NDKA as a diagnostic for bad outcomes at one year are 90% and 20%, respectively.</w:t>
-      </w:r>
-    </w:p>
-    <w:p>
-      <w:pPr>
-        <w:pStyle w:val="BodyText"/>
-      </w:pPr>
-      <w:r>
-        <w:t xml:space="preserve">What is the negative predictive value (NPV) of “high NDKA” as a diagnostic for bad outcomes? Explain your reasoning and show your work. The negative predictive value is the probability that a patient does NOT have a bad outcome at the one year mark, given that their test was negative (i.e., they did NOT have a severe WFNS score). Please provide a numerical answer by using R’s calculator capability (i.e., insert an R chunk and show your work in code to calculate the answer). Be careful with parentheses!</w:t>
-      </w:r>
-    </w:p>
-    <w:bookmarkEnd w:id="13"/>
-    <w:bookmarkStart w:id="17" w:name="exercise-4-roc-curve"/>
-    <w:p>
-      <w:pPr>
-        <w:pStyle w:val="Heading2"/>
-      </w:pPr>
-      <w:r>
-        <w:t xml:space="preserve">Exercise 4: ROC Curve</w:t>
+        <w:t xml:space="preserve">Exercise 3: ROC Curve</w:t>
       </w:r>
     </w:p>
     <w:p>
@@ -410,18 +368,18 @@
           <wp:inline>
             <wp:extent cx="3810000" cy="3965964"/>
             <wp:effectExtent b="0" l="0" r="0" t="0"/>
-            <wp:docPr descr="" title="" id="15" name="Picture"/>
+            <wp:docPr descr="" title="" id="14" name="Picture"/>
             <a:graphic>
               <a:graphicData uri="http://schemas.openxmlformats.org/drawingml/2006/picture">
                 <pic:pic>
                   <pic:nvPicPr>
-                    <pic:cNvPr descr="images/hw-2/brain_roc.png" id="16" name="Picture"/>
+                    <pic:cNvPr descr="images/hw-2/brain_roc.png" id="15" name="Picture"/>
                     <pic:cNvPicPr>
                       <a:picLocks noChangeArrowheads="1" noChangeAspect="1"/>
                     </pic:cNvPicPr>
                   </pic:nvPicPr>
                   <pic:blipFill>
-                    <a:blip r:embed="rId14"/>
+                    <a:blip r:embed="rId13"/>
                     <a:stretch>
                       <a:fillRect/>
                     </a:stretch>
@@ -478,32 +436,32 @@
         <w:t xml:space="preserve">Which biomarker, NDKA or S100β, would you rather use to predict bad outcomes? Why? (For this question, do NOT use the phrase “area under the curve”)</w:t>
       </w:r>
     </w:p>
+    <w:bookmarkEnd w:id="16"/>
+    <w:bookmarkStart w:id="17" w:name="ai-attestation"/>
+    <w:p>
+      <w:pPr>
+        <w:pStyle w:val="Heading2"/>
+      </w:pPr>
+      <w:r>
+        <w:t xml:space="preserve">AI Attestation</w:t>
+      </w:r>
+    </w:p>
+    <w:p>
+      <w:pPr>
+        <w:pStyle w:val="FirstParagraph"/>
+      </w:pPr>
+      <w:r>
+        <w:t xml:space="preserve">Was AI used on this assignment? If so, describe your prompts below. If not, simply state</w:t>
+      </w:r>
+      <w:r>
+        <w:t xml:space="preserve"> </w:t>
+      </w:r>
+      <w:r>
+        <w:t xml:space="preserve">“AI was not used on this assignment.”</w:t>
+      </w:r>
+    </w:p>
     <w:bookmarkEnd w:id="17"/>
-    <w:bookmarkStart w:id="18" w:name="ai-attestation"/>
-    <w:p>
-      <w:pPr>
-        <w:pStyle w:val="Heading2"/>
-      </w:pPr>
-      <w:r>
-        <w:t xml:space="preserve">AI Attestation</w:t>
-      </w:r>
-    </w:p>
-    <w:p>
-      <w:pPr>
-        <w:pStyle w:val="FirstParagraph"/>
-      </w:pPr>
-      <w:r>
-        <w:t xml:space="preserve">Was AI used on this assignment? If so, describe your prompts below. If not, simply state</w:t>
-      </w:r>
-      <w:r>
-        <w:t xml:space="preserve"> </w:t>
-      </w:r>
-      <w:r>
-        <w:t xml:space="preserve">“AI was not used on this assignment.”</w:t>
-      </w:r>
-    </w:p>
-    <w:bookmarkEnd w:id="18"/>
-    <w:bookmarkStart w:id="19" w:name="submission"/>
+    <w:bookmarkStart w:id="18" w:name="submission"/>
     <w:p>
       <w:pPr>
         <w:pStyle w:val="Heading2"/>
@@ -608,8 +566,8 @@
         <w:t xml:space="preserve">section.</w:t>
       </w:r>
     </w:p>
-    <w:bookmarkEnd w:id="19"/>
-    <w:bookmarkStart w:id="20" w:name="grading"/>
+    <w:bookmarkEnd w:id="18"/>
+    <w:bookmarkStart w:id="19" w:name="grading"/>
     <w:p>
       <w:pPr>
         <w:pStyle w:val="Heading2"/>
@@ -735,30 +693,6 @@
               <w:pStyle w:val="Compact"/>
             </w:pPr>
             <w:r>
-              <w:t xml:space="preserve">Ex 4</w:t>
-            </w:r>
-          </w:p>
-        </w:tc>
-        <w:tc>
-          <w:tcPr/>
-          <w:p>
-            <w:pPr>
-              <w:pStyle w:val="Compact"/>
-            </w:pPr>
-            <w:r>
-              <w:t xml:space="preserve">3</w:t>
-            </w:r>
-          </w:p>
-        </w:tc>
-      </w:tr>
-      <w:tr>
-        <w:tc>
-          <w:tcPr/>
-          <w:p>
-            <w:pPr>
-              <w:pStyle w:val="Compact"/>
-            </w:pPr>
-            <w:r>
               <w:t xml:space="preserve">AI Attestation</w:t>
             </w:r>
           </w:p>
@@ -808,7 +742,7 @@
         <w:t xml:space="preserve">The “Formatting” grade is to assess the document format. This includes having a neatly organized document (no excessive output, warnings/messages when loading packages and/or data) with readable code and your name and the date updated in the YAML.</w:t>
       </w:r>
     </w:p>
-    <w:bookmarkEnd w:id="20"/>
+    <w:bookmarkEnd w:id="19"/>
     <w:sectPr>
       <w:footnotePr>
         <w:numRestart w:val="eachSect"/>

</xml_diff>